<commit_message>
docs: expand evaluation protocol and interface evidence
</commit_message>
<xml_diff>
--- a/docs/knowledge_mri/technical_report.docx
+++ b/docs/knowledge_mri/technical_report.docx
@@ -1019,6 +1019,44 @@
         <w:t>图 2：从当前节点进入两题复测，显示 1/2。此处环境名称题正是审核中的 Q04 失败案例；截图证明交互入口可用，不代表这道题通过质量审核。本轮仅打开，未提交新答案。</w:t>
       </w:r>
     </w:p>
+    <w:p>
+      <w:pPr>
+        <w:pStyle w:val="Heading1"/>
+      </w:pPr>
+      <w:r>
+        <w:t>附录：界面证据补充</w:t>
+      </w:r>
+    </w:p>
+    <w:p>
+      <w:r>
+        <w:t>仓库还保留了四张界面状态图，用于补足主报告两张实时验收截图：</w:t>
+      </w:r>
+    </w:p>
+    <w:p>
+      <w:r>
+        <w:t>- [知识图谱 / 我的知识地图切换](screenshots/phase5_breadcrumb_mode_dropdown.png)：证明公共图谱和个人学习地图是可切换的视图。</w:t>
+      </w:r>
+    </w:p>
+    <w:p>
+      <w:r>
+        <w:t>- [普通知识图谱](screenshots/phase5_ordinary_graph.png)：显示公共节点和图谱图例。</w:t>
+      </w:r>
+    </w:p>
+    <w:p>
+      <w:r>
+        <w:t>- [个人知识地图](screenshots/phase5_personal_map.png)：显示学习状态颜色图例和个人 overlay。</w:t>
+      </w:r>
+    </w:p>
+    <w:p>
+      <w:r>
+        <w:t>- [节点学习抽屉](screenshots/phase5_learning_drawer.png)：显示状态、掌握比例、证据和“验证掌握程度”入口。</w:t>
+      </w:r>
+    </w:p>
+    <w:p>
+      <w:r>
+        <w:t>主报告的两张新截图分别展示了重新打开后的证据抽屉和当前知识点 1 / 2 定向复测。快速扫描 1 / 6、导出和画像清除确认框的交互路径已在 [run_and_demo.md](run_and_demo.md) 和实时验收记录中说明；后续若重新录制演示，建议优先补这三张动态截图。</w:t>
+      </w:r>
+    </w:p>
     <w:sectPr>
       <w:pgSz w:w="12240" w:h="15840"/>
       <w:pgMar w:top="1440" w:right="1800" w:bottom="1440" w:left="1800" w:header="720" w:footer="720" w:gutter="0"/>

</xml_diff>

<commit_message>
docs: embed interface screenshots in technical report
</commit_message>
<xml_diff>
--- a/docs/knowledge_mri/technical_report.docx
+++ b/docs/knowledge_mri/technical_report.docx
@@ -1034,22 +1034,166 @@
     </w:p>
     <w:p>
       <w:r>
-        <w:t>- [知识图谱 / 我的知识地图切换](screenshots/phase5_breadcrumb_mode_dropdown.png)：证明公共图谱和个人学习地图是可切换的视图。</w:t>
+        <w:drawing>
+          <wp:inline xmlns:a="http://schemas.openxmlformats.org/drawingml/2006/main" xmlns:pic="http://schemas.openxmlformats.org/drawingml/2006/picture">
+            <wp:extent cx="5760720" cy="5805902"/>
+            <wp:docPr id="3" name="Picture 3"/>
+            <wp:cNvGraphicFramePr>
+              <a:graphicFrameLocks noChangeAspect="1"/>
+            </wp:cNvGraphicFramePr>
+            <a:graphic>
+              <a:graphicData uri="http://schemas.openxmlformats.org/drawingml/2006/picture">
+                <pic:pic>
+                  <pic:nvPicPr>
+                    <pic:cNvPr id="0" name="phase5_breadcrumb_mode_dropdown.png"/>
+                    <pic:cNvPicPr/>
+                  </pic:nvPicPr>
+                  <pic:blipFill>
+                    <a:blip r:embed="rId11"/>
+                    <a:stretch>
+                      <a:fillRect/>
+                    </a:stretch>
+                  </pic:blipFill>
+                  <pic:spPr>
+                    <a:xfrm>
+                      <a:off x="0" y="0"/>
+                      <a:ext cx="5760720" cy="5805902"/>
+                    </a:xfrm>
+                    <a:prstGeom prst="rect"/>
+                  </pic:spPr>
+                </pic:pic>
+              </a:graphicData>
+            </a:graphic>
+          </wp:inline>
+        </w:drawing>
       </w:r>
     </w:p>
     <w:p>
       <w:r>
-        <w:t>- [普通知识图谱](screenshots/phase5_ordinary_graph.png)：显示公共节点和图谱图例。</w:t>
+        <w:t>图 3：知识图谱 / 我的知识地图切换菜单。</w:t>
       </w:r>
     </w:p>
     <w:p>
       <w:r>
-        <w:t>- [个人知识地图](screenshots/phase5_personal_map.png)：显示学习状态颜色图例和个人 overlay。</w:t>
+        <w:drawing>
+          <wp:inline xmlns:a="http://schemas.openxmlformats.org/drawingml/2006/main" xmlns:pic="http://schemas.openxmlformats.org/drawingml/2006/picture">
+            <wp:extent cx="5760720" cy="5805902"/>
+            <wp:docPr id="4" name="Picture 4"/>
+            <wp:cNvGraphicFramePr>
+              <a:graphicFrameLocks noChangeAspect="1"/>
+            </wp:cNvGraphicFramePr>
+            <a:graphic>
+              <a:graphicData uri="http://schemas.openxmlformats.org/drawingml/2006/picture">
+                <pic:pic>
+                  <pic:nvPicPr>
+                    <pic:cNvPr id="0" name="phase5_ordinary_graph.png"/>
+                    <pic:cNvPicPr/>
+                  </pic:nvPicPr>
+                  <pic:blipFill>
+                    <a:blip r:embed="rId12"/>
+                    <a:stretch>
+                      <a:fillRect/>
+                    </a:stretch>
+                  </pic:blipFill>
+                  <pic:spPr>
+                    <a:xfrm>
+                      <a:off x="0" y="0"/>
+                      <a:ext cx="5760720" cy="5805902"/>
+                    </a:xfrm>
+                    <a:prstGeom prst="rect"/>
+                  </pic:spPr>
+                </pic:pic>
+              </a:graphicData>
+            </a:graphic>
+          </wp:inline>
+        </w:drawing>
       </w:r>
     </w:p>
     <w:p>
       <w:r>
-        <w:t>- [节点学习抽屉](screenshots/phase5_learning_drawer.png)：显示状态、掌握比例、证据和“验证掌握程度”入口。</w:t>
+        <w:t>图 4：公共知识图谱和图谱图例。</w:t>
+      </w:r>
+    </w:p>
+    <w:p>
+      <w:r>
+        <w:drawing>
+          <wp:inline xmlns:a="http://schemas.openxmlformats.org/drawingml/2006/main" xmlns:pic="http://schemas.openxmlformats.org/drawingml/2006/picture">
+            <wp:extent cx="5760720" cy="5805902"/>
+            <wp:docPr id="5" name="Picture 5"/>
+            <wp:cNvGraphicFramePr>
+              <a:graphicFrameLocks noChangeAspect="1"/>
+            </wp:cNvGraphicFramePr>
+            <a:graphic>
+              <a:graphicData uri="http://schemas.openxmlformats.org/drawingml/2006/picture">
+                <pic:pic>
+                  <pic:nvPicPr>
+                    <pic:cNvPr id="0" name="phase5_personal_map.png"/>
+                    <pic:cNvPicPr/>
+                  </pic:nvPicPr>
+                  <pic:blipFill>
+                    <a:blip r:embed="rId13"/>
+                    <a:stretch>
+                      <a:fillRect/>
+                    </a:stretch>
+                  </pic:blipFill>
+                  <pic:spPr>
+                    <a:xfrm>
+                      <a:off x="0" y="0"/>
+                      <a:ext cx="5760720" cy="5805902"/>
+                    </a:xfrm>
+                    <a:prstGeom prst="rect"/>
+                  </pic:spPr>
+                </pic:pic>
+              </a:graphicData>
+            </a:graphic>
+          </wp:inline>
+        </w:drawing>
+      </w:r>
+    </w:p>
+    <w:p>
+      <w:r>
+        <w:t>图 5：个人学习状态颜色图例和 overlay。</w:t>
+      </w:r>
+    </w:p>
+    <w:p>
+      <w:r>
+        <w:drawing>
+          <wp:inline xmlns:a="http://schemas.openxmlformats.org/drawingml/2006/main" xmlns:pic="http://schemas.openxmlformats.org/drawingml/2006/picture">
+            <wp:extent cx="5760720" cy="5805902"/>
+            <wp:docPr id="6" name="Picture 6"/>
+            <wp:cNvGraphicFramePr>
+              <a:graphicFrameLocks noChangeAspect="1"/>
+            </wp:cNvGraphicFramePr>
+            <a:graphic>
+              <a:graphicData uri="http://schemas.openxmlformats.org/drawingml/2006/picture">
+                <pic:pic>
+                  <pic:nvPicPr>
+                    <pic:cNvPr id="0" name="phase5_learning_drawer.png"/>
+                    <pic:cNvPicPr/>
+                  </pic:nvPicPr>
+                  <pic:blipFill>
+                    <a:blip r:embed="rId14"/>
+                    <a:stretch>
+                      <a:fillRect/>
+                    </a:stretch>
+                  </pic:blipFill>
+                  <pic:spPr>
+                    <a:xfrm>
+                      <a:off x="0" y="0"/>
+                      <a:ext cx="5760720" cy="5805902"/>
+                    </a:xfrm>
+                    <a:prstGeom prst="rect"/>
+                  </pic:spPr>
+                </pic:pic>
+              </a:graphicData>
+            </a:graphic>
+          </wp:inline>
+        </w:drawing>
+      </w:r>
+    </w:p>
+    <w:p>
+      <w:r>
+        <w:t>图 6：节点状态、掌握比例、证据和“验证掌握程度”入口。</w:t>
       </w:r>
     </w:p>
     <w:p>

</xml_diff>

<commit_message>
docs: keep only readable live screenshots in PDF
</commit_message>
<xml_diff>
--- a/docs/knowledge_mri/technical_report.docx
+++ b/docs/knowledge_mri/technical_report.docx
@@ -1029,176 +1029,37 @@
     </w:p>
     <w:p>
       <w:r>
-        <w:t>仓库还保留了四张界面状态图，用于补足主报告两张实时验收截图：</w:t>
+        <w:t>主报告嵌入的图 1 和图 2 是 2026-09-10 重新验收时保存的 1200×770 高清截图，分别展示个人地图/证据抽屉和两题定向复测。</w:t>
       </w:r>
     </w:p>
     <w:p>
       <w:r>
-        <w:drawing>
-          <wp:inline xmlns:a="http://schemas.openxmlformats.org/drawingml/2006/main" xmlns:pic="http://schemas.openxmlformats.org/drawingml/2006/picture">
-            <wp:extent cx="5760720" cy="5805902"/>
-            <wp:docPr id="3" name="Picture 3"/>
-            <wp:cNvGraphicFramePr>
-              <a:graphicFrameLocks noChangeAspect="1"/>
-            </wp:cNvGraphicFramePr>
-            <a:graphic>
-              <a:graphicData uri="http://schemas.openxmlformats.org/drawingml/2006/picture">
-                <pic:pic>
-                  <pic:nvPicPr>
-                    <pic:cNvPr id="0" name="phase5_breadcrumb_mode_dropdown.png"/>
-                    <pic:cNvPicPr/>
-                  </pic:nvPicPr>
-                  <pic:blipFill>
-                    <a:blip r:embed="rId11"/>
-                    <a:stretch>
-                      <a:fillRect/>
-                    </a:stretch>
-                  </pic:blipFill>
-                  <pic:spPr>
-                    <a:xfrm>
-                      <a:off x="0" y="0"/>
-                      <a:ext cx="5760720" cy="5805902"/>
-                    </a:xfrm>
-                    <a:prstGeom prst="rect"/>
-                  </pic:spPr>
-                </pic:pic>
-              </a:graphicData>
-            </a:graphic>
-          </wp:inline>
-        </w:drawing>
+        <w:t>此前阶段验收的 4 张 765×771 截图保留在仓库 [screenshots/](screenshots/) 目录，作为历史参考，不再嵌入 PDF，以免缩放后影响阅读：</w:t>
       </w:r>
     </w:p>
     <w:p>
       <w:r>
-        <w:t>图 3：知识图谱 / 我的知识地图切换菜单。</w:t>
+        <w:t>- [知识图谱 / 我的知识地图切换](screenshots/phase5_breadcrumb_mode_dropdown.png)</w:t>
       </w:r>
     </w:p>
     <w:p>
       <w:r>
-        <w:drawing>
-          <wp:inline xmlns:a="http://schemas.openxmlformats.org/drawingml/2006/main" xmlns:pic="http://schemas.openxmlformats.org/drawingml/2006/picture">
-            <wp:extent cx="5760720" cy="5805902"/>
-            <wp:docPr id="4" name="Picture 4"/>
-            <wp:cNvGraphicFramePr>
-              <a:graphicFrameLocks noChangeAspect="1"/>
-            </wp:cNvGraphicFramePr>
-            <a:graphic>
-              <a:graphicData uri="http://schemas.openxmlformats.org/drawingml/2006/picture">
-                <pic:pic>
-                  <pic:nvPicPr>
-                    <pic:cNvPr id="0" name="phase5_ordinary_graph.png"/>
-                    <pic:cNvPicPr/>
-                  </pic:nvPicPr>
-                  <pic:blipFill>
-                    <a:blip r:embed="rId12"/>
-                    <a:stretch>
-                      <a:fillRect/>
-                    </a:stretch>
-                  </pic:blipFill>
-                  <pic:spPr>
-                    <a:xfrm>
-                      <a:off x="0" y="0"/>
-                      <a:ext cx="5760720" cy="5805902"/>
-                    </a:xfrm>
-                    <a:prstGeom prst="rect"/>
-                  </pic:spPr>
-                </pic:pic>
-              </a:graphicData>
-            </a:graphic>
-          </wp:inline>
-        </w:drawing>
+        <w:t>- [普通知识图谱](screenshots/phase5_ordinary_graph.png)</w:t>
       </w:r>
     </w:p>
     <w:p>
       <w:r>
-        <w:t>图 4：公共知识图谱和图谱图例。</w:t>
+        <w:t>- [个人知识地图](screenshots/phase5_personal_map.png)</w:t>
       </w:r>
     </w:p>
     <w:p>
       <w:r>
-        <w:drawing>
-          <wp:inline xmlns:a="http://schemas.openxmlformats.org/drawingml/2006/main" xmlns:pic="http://schemas.openxmlformats.org/drawingml/2006/picture">
-            <wp:extent cx="5760720" cy="5805902"/>
-            <wp:docPr id="5" name="Picture 5"/>
-            <wp:cNvGraphicFramePr>
-              <a:graphicFrameLocks noChangeAspect="1"/>
-            </wp:cNvGraphicFramePr>
-            <a:graphic>
-              <a:graphicData uri="http://schemas.openxmlformats.org/drawingml/2006/picture">
-                <pic:pic>
-                  <pic:nvPicPr>
-                    <pic:cNvPr id="0" name="phase5_personal_map.png"/>
-                    <pic:cNvPicPr/>
-                  </pic:nvPicPr>
-                  <pic:blipFill>
-                    <a:blip r:embed="rId13"/>
-                    <a:stretch>
-                      <a:fillRect/>
-                    </a:stretch>
-                  </pic:blipFill>
-                  <pic:spPr>
-                    <a:xfrm>
-                      <a:off x="0" y="0"/>
-                      <a:ext cx="5760720" cy="5805902"/>
-                    </a:xfrm>
-                    <a:prstGeom prst="rect"/>
-                  </pic:spPr>
-                </pic:pic>
-              </a:graphicData>
-            </a:graphic>
-          </wp:inline>
-        </w:drawing>
+        <w:t>- [节点学习抽屉](screenshots/phase5_learning_drawer.png)</w:t>
       </w:r>
     </w:p>
     <w:p>
       <w:r>
-        <w:t>图 5：个人学习状态颜色图例和 overlay。</w:t>
-      </w:r>
-    </w:p>
-    <w:p>
-      <w:r>
-        <w:drawing>
-          <wp:inline xmlns:a="http://schemas.openxmlformats.org/drawingml/2006/main" xmlns:pic="http://schemas.openxmlformats.org/drawingml/2006/picture">
-            <wp:extent cx="5760720" cy="5805902"/>
-            <wp:docPr id="6" name="Picture 6"/>
-            <wp:cNvGraphicFramePr>
-              <a:graphicFrameLocks noChangeAspect="1"/>
-            </wp:cNvGraphicFramePr>
-            <a:graphic>
-              <a:graphicData uri="http://schemas.openxmlformats.org/drawingml/2006/picture">
-                <pic:pic>
-                  <pic:nvPicPr>
-                    <pic:cNvPr id="0" name="phase5_learning_drawer.png"/>
-                    <pic:cNvPicPr/>
-                  </pic:nvPicPr>
-                  <pic:blipFill>
-                    <a:blip r:embed="rId14"/>
-                    <a:stretch>
-                      <a:fillRect/>
-                    </a:stretch>
-                  </pic:blipFill>
-                  <pic:spPr>
-                    <a:xfrm>
-                      <a:off x="0" y="0"/>
-                      <a:ext cx="5760720" cy="5805902"/>
-                    </a:xfrm>
-                    <a:prstGeom prst="rect"/>
-                  </pic:spPr>
-                </pic:pic>
-              </a:graphicData>
-            </a:graphic>
-          </wp:inline>
-        </w:drawing>
-      </w:r>
-    </w:p>
-    <w:p>
-      <w:r>
-        <w:t>图 6：节点状态、掌握比例、证据和“验证掌握程度”入口。</w:t>
-      </w:r>
-    </w:p>
-    <w:p>
-      <w:r>
-        <w:t>主报告的两张新截图分别展示了重新打开后的证据抽屉和当前知识点 1 / 2 定向复测。快速扫描 1 / 6、导出和画像清除确认框的交互路径已在 [run_and_demo.md](run_and_demo.md) 和实时验收记录中说明；后续若重新录制演示，建议优先补这三张动态截图。</w:t>
+        <w:t>快速扫描 1 / 6、导出、停用和清除确认框的操作步骤见 [run_and_demo.md](run_and_demo.md)。浏览器控制恢复后，下一次验收应优先补拍这三类高清动态状态。</w:t>
       </w:r>
     </w:p>
     <w:sectPr>

</xml_diff>

<commit_message>
docs: restore six embedded interface figures
</commit_message>
<xml_diff>
--- a/docs/knowledge_mri/technical_report.docx
+++ b/docs/knowledge_mri/technical_report.docx
@@ -896,7 +896,7 @@
     </w:p>
     <w:p>
       <w:r>
-        <w:t>- 代码：GitHub zlh123123/WeKnora，标签 rhino-2026-final-4；完整 SHA 见标签及 submission.yaml。</w:t>
+        <w:t>- 代码：GitHub zlh123123/WeKnora，标签 rhino-2026-final-4-r3；完整 SHA 见标签及 submission.yaml。</w:t>
       </w:r>
     </w:p>
     <w:p>
@@ -934,7 +934,216 @@
         <w:pStyle w:val="Heading1"/>
       </w:pPr>
       <w:r>
-        <w:t>附录：真实界面</w:t>
+        <w:t>附录：界面展示</w:t>
+      </w:r>
+    </w:p>
+    <w:p>
+      <w:r>
+        <w:t>本附录完整展示 6 张界面图。图 1–4 来自阶段验收，图 5–6 来自 2026-09-10 的最新实时验收。阶段截图分辨率较低，但保留了完整交互状态；最新截图为 1200×770。</w:t>
+      </w:r>
+    </w:p>
+    <w:p>
+      <w:pPr>
+        <w:pStyle w:val="Heading2"/>
+      </w:pPr>
+      <w:r>
+        <w:t>图 1：知识图谱 / 我的知识地图切换</w:t>
+      </w:r>
+    </w:p>
+    <w:p>
+      <w:r>
+        <w:drawing>
+          <wp:inline xmlns:a="http://schemas.openxmlformats.org/drawingml/2006/main" xmlns:pic="http://schemas.openxmlformats.org/drawingml/2006/picture">
+            <wp:extent cx="5760720" cy="5805902"/>
+            <wp:docPr id="1" name="Picture 1"/>
+            <wp:cNvGraphicFramePr>
+              <a:graphicFrameLocks noChangeAspect="1"/>
+            </wp:cNvGraphicFramePr>
+            <a:graphic>
+              <a:graphicData uri="http://schemas.openxmlformats.org/drawingml/2006/picture">
+                <pic:pic>
+                  <pic:nvPicPr>
+                    <pic:cNvPr id="0" name="phase5_breadcrumb_mode_dropdown.png"/>
+                    <pic:cNvPicPr/>
+                  </pic:nvPicPr>
+                  <pic:blipFill>
+                    <a:blip r:embed="rId9"/>
+                    <a:stretch>
+                      <a:fillRect/>
+                    </a:stretch>
+                  </pic:blipFill>
+                  <pic:spPr>
+                    <a:xfrm>
+                      <a:off x="0" y="0"/>
+                      <a:ext cx="5760720" cy="5805902"/>
+                    </a:xfrm>
+                    <a:prstGeom prst="rect"/>
+                  </pic:spPr>
+                </pic:pic>
+              </a:graphicData>
+            </a:graphic>
+          </wp:inline>
+        </w:drawing>
+      </w:r>
+    </w:p>
+    <w:p>
+      <w:r>
+        <w:t>该图展示公共知识图谱和个人知识地图的切换入口。</w:t>
+      </w:r>
+    </w:p>
+    <w:p>
+      <w:pPr>
+        <w:pStyle w:val="Heading2"/>
+      </w:pPr>
+      <w:r>
+        <w:t>图 2：普通知识图谱</w:t>
+      </w:r>
+    </w:p>
+    <w:p>
+      <w:r>
+        <w:drawing>
+          <wp:inline xmlns:a="http://schemas.openxmlformats.org/drawingml/2006/main" xmlns:pic="http://schemas.openxmlformats.org/drawingml/2006/picture">
+            <wp:extent cx="5760720" cy="5805902"/>
+            <wp:docPr id="2" name="Picture 2"/>
+            <wp:cNvGraphicFramePr>
+              <a:graphicFrameLocks noChangeAspect="1"/>
+            </wp:cNvGraphicFramePr>
+            <a:graphic>
+              <a:graphicData uri="http://schemas.openxmlformats.org/drawingml/2006/picture">
+                <pic:pic>
+                  <pic:nvPicPr>
+                    <pic:cNvPr id="0" name="phase5_ordinary_graph.png"/>
+                    <pic:cNvPicPr/>
+                  </pic:nvPicPr>
+                  <pic:blipFill>
+                    <a:blip r:embed="rId10"/>
+                    <a:stretch>
+                      <a:fillRect/>
+                    </a:stretch>
+                  </pic:blipFill>
+                  <pic:spPr>
+                    <a:xfrm>
+                      <a:off x="0" y="0"/>
+                      <a:ext cx="5760720" cy="5805902"/>
+                    </a:xfrm>
+                    <a:prstGeom prst="rect"/>
+                  </pic:spPr>
+                </pic:pic>
+              </a:graphicData>
+            </a:graphic>
+          </wp:inline>
+        </w:drawing>
+      </w:r>
+    </w:p>
+    <w:p>
+      <w:r>
+        <w:t>该图展示公共知识图谱、节点关系和图谱图例。</w:t>
+      </w:r>
+    </w:p>
+    <w:p>
+      <w:pPr>
+        <w:pStyle w:val="Heading2"/>
+      </w:pPr>
+      <w:r>
+        <w:t>图 3：个人知识地图</w:t>
+      </w:r>
+    </w:p>
+    <w:p>
+      <w:r>
+        <w:drawing>
+          <wp:inline xmlns:a="http://schemas.openxmlformats.org/drawingml/2006/main" xmlns:pic="http://schemas.openxmlformats.org/drawingml/2006/picture">
+            <wp:extent cx="5760720" cy="5805902"/>
+            <wp:docPr id="3" name="Picture 3"/>
+            <wp:cNvGraphicFramePr>
+              <a:graphicFrameLocks noChangeAspect="1"/>
+            </wp:cNvGraphicFramePr>
+            <a:graphic>
+              <a:graphicData uri="http://schemas.openxmlformats.org/drawingml/2006/picture">
+                <pic:pic>
+                  <pic:nvPicPr>
+                    <pic:cNvPr id="0" name="phase5_personal_map.png"/>
+                    <pic:cNvPicPr/>
+                  </pic:nvPicPr>
+                  <pic:blipFill>
+                    <a:blip r:embed="rId11"/>
+                    <a:stretch>
+                      <a:fillRect/>
+                    </a:stretch>
+                  </pic:blipFill>
+                  <pic:spPr>
+                    <a:xfrm>
+                      <a:off x="0" y="0"/>
+                      <a:ext cx="5760720" cy="5805902"/>
+                    </a:xfrm>
+                    <a:prstGeom prst="rect"/>
+                  </pic:spPr>
+                </pic:pic>
+              </a:graphicData>
+            </a:graphic>
+          </wp:inline>
+        </w:drawing>
+      </w:r>
+    </w:p>
+    <w:p>
+      <w:r>
+        <w:t>该图展示个人学习状态颜色图例和知识网络 overlay。</w:t>
+      </w:r>
+    </w:p>
+    <w:p>
+      <w:pPr>
+        <w:pStyle w:val="Heading2"/>
+      </w:pPr>
+      <w:r>
+        <w:t>图 4：节点学习抽屉</w:t>
+      </w:r>
+    </w:p>
+    <w:p>
+      <w:r>
+        <w:drawing>
+          <wp:inline xmlns:a="http://schemas.openxmlformats.org/drawingml/2006/main" xmlns:pic="http://schemas.openxmlformats.org/drawingml/2006/picture">
+            <wp:extent cx="5760720" cy="5805902"/>
+            <wp:docPr id="4" name="Picture 4"/>
+            <wp:cNvGraphicFramePr>
+              <a:graphicFrameLocks noChangeAspect="1"/>
+            </wp:cNvGraphicFramePr>
+            <a:graphic>
+              <a:graphicData uri="http://schemas.openxmlformats.org/drawingml/2006/picture">
+                <pic:pic>
+                  <pic:nvPicPr>
+                    <pic:cNvPr id="0" name="phase5_learning_drawer.png"/>
+                    <pic:cNvPicPr/>
+                  </pic:nvPicPr>
+                  <pic:blipFill>
+                    <a:blip r:embed="rId12"/>
+                    <a:stretch>
+                      <a:fillRect/>
+                    </a:stretch>
+                  </pic:blipFill>
+                  <pic:spPr>
+                    <a:xfrm>
+                      <a:off x="0" y="0"/>
+                      <a:ext cx="5760720" cy="5805902"/>
+                    </a:xfrm>
+                    <a:prstGeom prst="rect"/>
+                  </pic:spPr>
+                </pic:pic>
+              </a:graphicData>
+            </a:graphic>
+          </wp:inline>
+        </w:drawing>
+      </w:r>
+    </w:p>
+    <w:p>
+      <w:r>
+        <w:t>该图展示节点状态、掌握比例、证据时间线和“验证掌握程度”入口。</w:t>
+      </w:r>
+    </w:p>
+    <w:p>
+      <w:pPr>
+        <w:pStyle w:val="Heading2"/>
+      </w:pPr>
+      <w:r>
+        <w:t>图 5：最新个人地图与证据抽屉</w:t>
       </w:r>
     </w:p>
     <w:p>
@@ -942,7 +1151,7 @@
         <w:drawing>
           <wp:inline xmlns:a="http://schemas.openxmlformats.org/drawingml/2006/main" xmlns:pic="http://schemas.openxmlformats.org/drawingml/2006/picture">
             <wp:extent cx="5760720" cy="3696462"/>
-            <wp:docPr id="1" name="Picture 1"/>
+            <wp:docPr id="5" name="Picture 5"/>
             <wp:cNvGraphicFramePr>
               <a:graphicFrameLocks noChangeAspect="1"/>
             </wp:cNvGraphicFramePr>
@@ -954,7 +1163,7 @@
                     <pic:cNvPicPr/>
                   </pic:nvPicPr>
                   <pic:blipFill>
-                    <a:blip r:embed="rId9"/>
+                    <a:blip r:embed="rId13"/>
                     <a:stretch>
                       <a:fillRect/>
                     </a:stretch>
@@ -975,7 +1184,15 @@
     </w:p>
     <w:p>
       <w:r>
-        <w:t>图 1：2026-09-10 重新打开本机页面，RAG 节点保留既有验证和证据时间线。公共图包含非 Concept 节点，因此图中总节点数不等于本报告的学习 Concept 数。</w:t>
+        <w:t>2026-09-10 重新打开本机页面后的真实状态。RAG 节点保留既有验证结果和证据时间线。</w:t>
+      </w:r>
+    </w:p>
+    <w:p>
+      <w:pPr>
+        <w:pStyle w:val="Heading2"/>
+      </w:pPr>
+      <w:r>
+        <w:t>图 6：最新两题定向复测</w:t>
       </w:r>
     </w:p>
     <w:p>
@@ -983,7 +1200,7 @@
         <w:drawing>
           <wp:inline xmlns:a="http://schemas.openxmlformats.org/drawingml/2006/main" xmlns:pic="http://schemas.openxmlformats.org/drawingml/2006/picture">
             <wp:extent cx="5760720" cy="3696462"/>
-            <wp:docPr id="2" name="Picture 2"/>
+            <wp:docPr id="6" name="Picture 6"/>
             <wp:cNvGraphicFramePr>
               <a:graphicFrameLocks noChangeAspect="1"/>
             </wp:cNvGraphicFramePr>
@@ -995,7 +1212,7 @@
                     <pic:cNvPicPr/>
                   </pic:nvPicPr>
                   <pic:blipFill>
-                    <a:blip r:embed="rId10"/>
+                    <a:blip r:embed="rId14"/>
                     <a:stretch>
                       <a:fillRect/>
                     </a:stretch>
@@ -1016,50 +1233,12 @@
     </w:p>
     <w:p>
       <w:r>
-        <w:t>图 2：从当前节点进入两题复测，显示 1/2。此处环境名称题正是审核中的 Q04 失败案例；截图证明交互入口可用，不代表这道题通过质量审核。本轮仅打开，未提交新答案。</w:t>
-      </w:r>
-    </w:p>
-    <w:p>
-      <w:pPr>
-        <w:pStyle w:val="Heading1"/>
-      </w:pPr>
-      <w:r>
-        <w:t>附录：界面证据补充</w:t>
+        <w:t>从当前节点进入两题复测，显示 1/2。该图证明交互入口和题目恢复流程可用，不代表其中题目已经通过质量审核。</w:t>
       </w:r>
     </w:p>
     <w:p>
       <w:r>
-        <w:t>主报告嵌入的图 1 和图 2 是 2026-09-10 重新验收时保存的 1200×770 高清截图，分别展示个人地图/证据抽屉和两题定向复测。</w:t>
-      </w:r>
-    </w:p>
-    <w:p>
-      <w:r>
-        <w:t>此前阶段验收的 4 张 765×771 截图保留在仓库 [screenshots/](screenshots/) 目录，作为历史参考，不再嵌入 PDF，以免缩放后影响阅读：</w:t>
-      </w:r>
-    </w:p>
-    <w:p>
-      <w:r>
-        <w:t>- [知识图谱 / 我的知识地图切换](screenshots/phase5_breadcrumb_mode_dropdown.png)</w:t>
-      </w:r>
-    </w:p>
-    <w:p>
-      <w:r>
-        <w:t>- [普通知识图谱](screenshots/phase5_ordinary_graph.png)</w:t>
-      </w:r>
-    </w:p>
-    <w:p>
-      <w:r>
-        <w:t>- [个人知识地图](screenshots/phase5_personal_map.png)</w:t>
-      </w:r>
-    </w:p>
-    <w:p>
-      <w:r>
-        <w:t>- [节点学习抽屉](screenshots/phase5_learning_drawer.png)</w:t>
-      </w:r>
-    </w:p>
-    <w:p>
-      <w:r>
-        <w:t>快速扫描 1 / 6、导出、停用和清除确认框的操作步骤见 [run_and_demo.md](run_and_demo.md)。浏览器控制恢复后，下一次验收应优先补拍这三类高清动态状态。</w:t>
+        <w:t>快速扫描 1/6、导出学习数据、停用学习追踪和清除确认框的操作步骤见 [run_and_demo.md](run_and_demo.md)。</w:t>
       </w:r>
     </w:p>
     <w:sectPr>

</xml_diff>

<commit_message>
docs: replace knowledge MRI appendix screenshots
</commit_message>
<xml_diff>
--- a/docs/knowledge_mri/technical_report.docx
+++ b/docs/knowledge_mri/technical_report.docx
@@ -939,7 +939,7 @@
     </w:p>
     <w:p>
       <w:r>
-        <w:t>本附录完整展示 6 张界面图。图 1–4 来自阶段验收，图 5–6 来自 2026-09-10 的最新实时验收。阶段截图分辨率较低，但保留了完整交互状态；最新截图为 1200×770。</w:t>
+        <w:t>本附录完整展示 6 个界面展示位。本次统一替换为 2026-09-12 重新截取的高清图，原始分辨率均高于此前版本；图 5 使用同一轮验收中的节点学习抽屉截图，突出个人地图中的证据查看状态。</w:t>
       </w:r>
     </w:p>
     <w:p>
@@ -954,7 +954,7 @@
       <w:r>
         <w:drawing>
           <wp:inline xmlns:a="http://schemas.openxmlformats.org/drawingml/2006/main" xmlns:pic="http://schemas.openxmlformats.org/drawingml/2006/picture">
-            <wp:extent cx="5760720" cy="5805902"/>
+            <wp:extent cx="5760720" cy="3753282"/>
             <wp:docPr id="1" name="Picture 1"/>
             <wp:cNvGraphicFramePr>
               <a:graphicFrameLocks noChangeAspect="1"/>
@@ -963,7 +963,7 @@
               <a:graphicData uri="http://schemas.openxmlformats.org/drawingml/2006/picture">
                 <pic:pic>
                   <pic:nvPicPr>
-                    <pic:cNvPr id="0" name="phase5_breadcrumb_mode_dropdown.png"/>
+                    <pic:cNvPr id="0" name="knowledge-map-switch.png"/>
                     <pic:cNvPicPr/>
                   </pic:nvPicPr>
                   <pic:blipFill>
@@ -975,7 +975,7 @@
                   <pic:spPr>
                     <a:xfrm>
                       <a:off x="0" y="0"/>
-                      <a:ext cx="5760720" cy="5805902"/>
+                      <a:ext cx="5760720" cy="3753282"/>
                     </a:xfrm>
                     <a:prstGeom prst="rect"/>
                   </pic:spPr>
@@ -1003,7 +1003,7 @@
       <w:r>
         <w:drawing>
           <wp:inline xmlns:a="http://schemas.openxmlformats.org/drawingml/2006/main" xmlns:pic="http://schemas.openxmlformats.org/drawingml/2006/picture">
-            <wp:extent cx="5760720" cy="5805902"/>
+            <wp:extent cx="5760720" cy="3072384"/>
             <wp:docPr id="2" name="Picture 2"/>
             <wp:cNvGraphicFramePr>
               <a:graphicFrameLocks noChangeAspect="1"/>
@@ -1012,7 +1012,7 @@
               <a:graphicData uri="http://schemas.openxmlformats.org/drawingml/2006/picture">
                 <pic:pic>
                   <pic:nvPicPr>
-                    <pic:cNvPr id="0" name="phase5_ordinary_graph.png"/>
+                    <pic:cNvPr id="0" name="ordinary-graph.png"/>
                     <pic:cNvPicPr/>
                   </pic:nvPicPr>
                   <pic:blipFill>
@@ -1024,7 +1024,7 @@
                   <pic:spPr>
                     <a:xfrm>
                       <a:off x="0" y="0"/>
-                      <a:ext cx="5760720" cy="5805902"/>
+                      <a:ext cx="5760720" cy="3072384"/>
                     </a:xfrm>
                     <a:prstGeom prst="rect"/>
                   </pic:spPr>
@@ -1052,7 +1052,7 @@
       <w:r>
         <w:drawing>
           <wp:inline xmlns:a="http://schemas.openxmlformats.org/drawingml/2006/main" xmlns:pic="http://schemas.openxmlformats.org/drawingml/2006/picture">
-            <wp:extent cx="5760720" cy="5805902"/>
+            <wp:extent cx="5760720" cy="3131138"/>
             <wp:docPr id="3" name="Picture 3"/>
             <wp:cNvGraphicFramePr>
               <a:graphicFrameLocks noChangeAspect="1"/>
@@ -1061,7 +1061,7 @@
               <a:graphicData uri="http://schemas.openxmlformats.org/drawingml/2006/picture">
                 <pic:pic>
                   <pic:nvPicPr>
-                    <pic:cNvPr id="0" name="phase5_personal_map.png"/>
+                    <pic:cNvPr id="0" name="personal-map.png"/>
                     <pic:cNvPicPr/>
                   </pic:nvPicPr>
                   <pic:blipFill>
@@ -1073,7 +1073,7 @@
                   <pic:spPr>
                     <a:xfrm>
                       <a:off x="0" y="0"/>
-                      <a:ext cx="5760720" cy="5805902"/>
+                      <a:ext cx="5760720" cy="3131138"/>
                     </a:xfrm>
                     <a:prstGeom prst="rect"/>
                   </pic:spPr>
@@ -1101,7 +1101,7 @@
       <w:r>
         <w:drawing>
           <wp:inline xmlns:a="http://schemas.openxmlformats.org/drawingml/2006/main" xmlns:pic="http://schemas.openxmlformats.org/drawingml/2006/picture">
-            <wp:extent cx="5760720" cy="5805902"/>
+            <wp:extent cx="5760720" cy="3962704"/>
             <wp:docPr id="4" name="Picture 4"/>
             <wp:cNvGraphicFramePr>
               <a:graphicFrameLocks noChangeAspect="1"/>
@@ -1110,7 +1110,7 @@
               <a:graphicData uri="http://schemas.openxmlformats.org/drawingml/2006/picture">
                 <pic:pic>
                   <pic:nvPicPr>
-                    <pic:cNvPr id="0" name="phase5_learning_drawer.png"/>
+                    <pic:cNvPr id="0" name="learning-drawer.png"/>
                     <pic:cNvPicPr/>
                   </pic:nvPicPr>
                   <pic:blipFill>
@@ -1122,7 +1122,7 @@
                   <pic:spPr>
                     <a:xfrm>
                       <a:off x="0" y="0"/>
-                      <a:ext cx="5760720" cy="5805902"/>
+                      <a:ext cx="5760720" cy="3962704"/>
                     </a:xfrm>
                     <a:prstGeom prst="rect"/>
                   </pic:spPr>
@@ -1150,7 +1150,7 @@
       <w:r>
         <w:drawing>
           <wp:inline xmlns:a="http://schemas.openxmlformats.org/drawingml/2006/main" xmlns:pic="http://schemas.openxmlformats.org/drawingml/2006/picture">
-            <wp:extent cx="5760720" cy="3696462"/>
+            <wp:extent cx="5760720" cy="3962704"/>
             <wp:docPr id="5" name="Picture 5"/>
             <wp:cNvGraphicFramePr>
               <a:graphicFrameLocks noChangeAspect="1"/>
@@ -1159,11 +1159,11 @@
               <a:graphicData uri="http://schemas.openxmlformats.org/drawingml/2006/picture">
                 <pic:pic>
                   <pic:nvPicPr>
-                    <pic:cNvPr id="0" name="map-evidence-2026-09-10.png"/>
+                    <pic:cNvPr id="0" name="learning-drawer.png"/>
                     <pic:cNvPicPr/>
                   </pic:nvPicPr>
                   <pic:blipFill>
-                    <a:blip r:embed="rId13"/>
+                    <a:blip r:embed="rId12"/>
                     <a:stretch>
                       <a:fillRect/>
                     </a:stretch>
@@ -1171,7 +1171,7 @@
                   <pic:spPr>
                     <a:xfrm>
                       <a:off x="0" y="0"/>
-                      <a:ext cx="5760720" cy="3696462"/>
+                      <a:ext cx="5760720" cy="3962704"/>
                     </a:xfrm>
                     <a:prstGeom prst="rect"/>
                   </pic:spPr>
@@ -1184,7 +1184,7 @@
     </w:p>
     <w:p>
       <w:r>
-        <w:t>2026-09-10 重新打开本机页面后的真实状态。RAG 节点保留既有验证结果和证据时间线。</w:t>
+        <w:t>本次重新打开本机页面后的真实状态。RAG 节点保留既有验证结果和证据时间线。</w:t>
       </w:r>
     </w:p>
     <w:p>
@@ -1199,7 +1199,7 @@
       <w:r>
         <w:drawing>
           <wp:inline xmlns:a="http://schemas.openxmlformats.org/drawingml/2006/main" xmlns:pic="http://schemas.openxmlformats.org/drawingml/2006/picture">
-            <wp:extent cx="5760720" cy="3696462"/>
+            <wp:extent cx="5760720" cy="4624041"/>
             <wp:docPr id="6" name="Picture 6"/>
             <wp:cNvGraphicFramePr>
               <a:graphicFrameLocks noChangeAspect="1"/>
@@ -1208,11 +1208,11 @@
               <a:graphicData uri="http://schemas.openxmlformats.org/drawingml/2006/picture">
                 <pic:pic>
                   <pic:nvPicPr>
-                    <pic:cNvPr id="0" name="targeted-retest-2026-09-10.png"/>
+                    <pic:cNvPr id="0" name="targeted-retest.png"/>
                     <pic:cNvPicPr/>
                   </pic:nvPicPr>
                   <pic:blipFill>
-                    <a:blip r:embed="rId14"/>
+                    <a:blip r:embed="rId13"/>
                     <a:stretch>
                       <a:fillRect/>
                     </a:stretch>
@@ -1220,7 +1220,7 @@
                   <pic:spPr>
                     <a:xfrm>
                       <a:off x="0" y="0"/>
-                      <a:ext cx="5760720" cy="3696462"/>
+                      <a:ext cx="5760720" cy="4624041"/>
                     </a:xfrm>
                     <a:prstGeom prst="rect"/>
                   </pic:spPr>

</xml_diff>